<commit_message>
feat: polish CV typography and layout, keep single-column ATS structure
Hierarquia por tamanho e cor, filetes de secao, contato em duas linhas e
formacao com curso e escola em linhas separadas. Texto e ordem do conteudo mantidos.
</commit_message>
<xml_diff>
--- a/cv.docx
+++ b/cv.docx
@@ -4,36 +4,68 @@
   <w:body>
     <w:p>
       <w:pPr>
-        <w:jc w:val="left"/>
+        <w:spacing w:after="0"/>
       </w:pPr>
       <w:r>
         <w:rPr>
           <w:b/>
-          <w:sz w:val="40"/>
+          <w:color w:val="1D2350"/>
+          <w:sz w:val="48"/>
         </w:rPr>
         <w:t>Ali Mohamed Khodr</w:t>
       </w:r>
     </w:p>
     <w:p>
+      <w:pPr>
+        <w:spacing w:after="40"/>
+      </w:pPr>
       <w:r>
         <w:rPr>
           <w:b/>
+          <w:color w:val="4F52C9"/>
+          <w:sz w:val="22"/>
         </w:rPr>
         <w:t>Software Engineer | Full-stack: Vue, Nuxt, Ruby on Rails, Node.js</w:t>
       </w:r>
     </w:p>
     <w:p>
+      <w:pPr>
+        <w:spacing w:after="120"/>
+        <w:pBdr>
+          <w:bottom w:val="single" w:sz="12" w:space="2" w:color="4f52c9"/>
+        </w:pBdr>
+      </w:pPr>
       <w:r>
-        <w:t>São José dos Campos, SP | ali.m.khodr@gmail.com | (12) 98859-4305 | linkedin.com/in/alimohamedkhodr | github.com/alimkhodr</w:t>
+        <w:rPr>
+          <w:color w:val="5B6185"/>
+          <w:sz w:val="19"/>
+        </w:rPr>
+        <w:t>São José dos Campos, SP  |  ali.m.khodr@gmail.com  |  (12) 98859-4305</w:t>
+        <w:br/>
+      </w:r>
+      <w:r>
+        <w:rPr>
+          <w:color w:val="5B6185"/>
+          <w:sz w:val="19"/>
+        </w:rPr>
+        <w:t>linkedin.com/in/alimohamedkhodr  |  github.com/alimkhodr</w:t>
       </w:r>
     </w:p>
     <w:p>
       <w:pPr>
-        <w:pStyle w:val="Heading2"/>
-        <w:spacing w:before="200" w:after="60"/>
+        <w:keepNext/>
+        <w:spacing w:before="240" w:after="100"/>
+        <w:pBdr>
+          <w:bottom w:val="single" w:sz="6" w:space="2" w:color="d9dcf0"/>
+        </w:pBdr>
       </w:pPr>
       <w:r>
-        <w:t>Resumo Profissional</w:t>
+        <w:rPr>
+          <w:b/>
+          <w:color w:val="4F52C9"/>
+          <w:sz w:val="21"/>
+        </w:rPr>
+        <w:t>RESUMO PROFISSIONAL</w:t>
       </w:r>
     </w:p>
     <w:p>
@@ -43,17 +75,29 @@
     </w:p>
     <w:p>
       <w:pPr>
-        <w:pStyle w:val="Heading2"/>
-        <w:spacing w:before="200" w:after="60"/>
+        <w:keepNext/>
+        <w:spacing w:before="240" w:after="100"/>
+        <w:pBdr>
+          <w:bottom w:val="single" w:sz="6" w:space="2" w:color="d9dcf0"/>
+        </w:pBdr>
       </w:pPr>
       <w:r>
-        <w:t>Competências Técnicas</w:t>
+        <w:rPr>
+          <w:b/>
+          <w:color w:val="4F52C9"/>
+          <w:sz w:val="21"/>
+        </w:rPr>
+        <w:t>COMPETÊNCIAS TÉCNICAS</w:t>
       </w:r>
     </w:p>
     <w:p>
+      <w:pPr>
+        <w:spacing w:after="40"/>
+      </w:pPr>
       <w:r>
         <w:rPr>
           <w:b/>
+          <w:color w:val="1D2350"/>
         </w:rPr>
         <w:t xml:space="preserve">Linguagens: </w:t>
       </w:r>
@@ -62,9 +106,13 @@
       </w:r>
     </w:p>
     <w:p>
+      <w:pPr>
+        <w:spacing w:after="40"/>
+      </w:pPr>
       <w:r>
         <w:rPr>
           <w:b/>
+          <w:color w:val="1D2350"/>
         </w:rPr>
         <w:t xml:space="preserve">Frontend: </w:t>
       </w:r>
@@ -73,9 +121,13 @@
       </w:r>
     </w:p>
     <w:p>
+      <w:pPr>
+        <w:spacing w:after="40"/>
+      </w:pPr>
       <w:r>
         <w:rPr>
           <w:b/>
+          <w:color w:val="1D2350"/>
         </w:rPr>
         <w:t xml:space="preserve">Backend e APIs: </w:t>
       </w:r>
@@ -84,9 +136,13 @@
       </w:r>
     </w:p>
     <w:p>
+      <w:pPr>
+        <w:spacing w:after="40"/>
+      </w:pPr>
       <w:r>
         <w:rPr>
           <w:b/>
+          <w:color w:val="1D2350"/>
         </w:rPr>
         <w:t xml:space="preserve">Infraestrutura: </w:t>
       </w:r>
@@ -95,9 +151,13 @@
       </w:r>
     </w:p>
     <w:p>
+      <w:pPr>
+        <w:spacing w:after="40"/>
+      </w:pPr>
       <w:r>
         <w:rPr>
           <w:b/>
+          <w:color w:val="1D2350"/>
         </w:rPr>
         <w:t xml:space="preserve">Dados: </w:t>
       </w:r>
@@ -106,9 +166,13 @@
       </w:r>
     </w:p>
     <w:p>
+      <w:pPr>
+        <w:spacing w:after="40"/>
+      </w:pPr>
       <w:r>
         <w:rPr>
           <w:b/>
+          <w:color w:val="1D2350"/>
         </w:rPr>
         <w:t xml:space="preserve">Domínios: </w:t>
       </w:r>
@@ -117,9 +181,13 @@
       </w:r>
     </w:p>
     <w:p>
+      <w:pPr>
+        <w:spacing w:after="40"/>
+      </w:pPr>
       <w:r>
         <w:rPr>
           <w:b/>
+          <w:color w:val="1D2350"/>
         </w:rPr>
         <w:t xml:space="preserve">Práticas e ferramentas: </w:t>
       </w:r>
@@ -129,33 +197,57 @@
     </w:p>
     <w:p>
       <w:pPr>
-        <w:pStyle w:val="Heading2"/>
-        <w:spacing w:before="200" w:after="60"/>
+        <w:keepNext/>
+        <w:spacing w:before="240" w:after="100"/>
+        <w:pBdr>
+          <w:bottom w:val="single" w:sz="6" w:space="2" w:color="d9dcf0"/>
+        </w:pBdr>
       </w:pPr>
       <w:r>
-        <w:t>Experiência Profissional</w:t>
+        <w:rPr>
+          <w:b/>
+          <w:color w:val="4F52C9"/>
+          <w:sz w:val="21"/>
+        </w:rPr>
+        <w:t>EXPERIÊNCIA PROFISSIONAL</w:t>
       </w:r>
     </w:p>
     <w:p>
+      <w:pPr>
+        <w:keepNext/>
+        <w:spacing w:before="120" w:after="0"/>
+      </w:pPr>
       <w:r>
         <w:rPr>
           <w:b/>
+          <w:sz w:val="23"/>
         </w:rPr>
         <w:t>Qeevo Group (ex-Quero Educação)</w:t>
       </w:r>
       <w:r>
-        <w:t xml:space="preserve"> | São José dos Campos, SP</w:t>
+        <w:rPr>
+          <w:color w:val="5B6185"/>
+        </w:rPr>
+        <w:t xml:space="preserve">   São José dos Campos, SP</w:t>
       </w:r>
     </w:p>
     <w:p>
+      <w:pPr>
+        <w:keepNext/>
+        <w:spacing w:before="80" w:after="40"/>
+      </w:pPr>
       <w:r>
         <w:rPr>
           <w:b/>
+          <w:color w:val="4F52C9"/>
         </w:rPr>
         <w:t>Software Engineer</w:t>
       </w:r>
       <w:r>
-        <w:t xml:space="preserve"> | 2025 - atual</w:t>
+        <w:rPr>
+          <w:color w:val="5B6185"/>
+        </w:rPr>
+        <w:t xml:space="preserve">   2025 - atual</w:t>
       </w:r>
     </w:p>
     <w:p>
@@ -199,22 +291,35 @@
       </w:r>
     </w:p>
     <w:p>
+      <w:pPr>
+        <w:spacing w:after="80"/>
+      </w:pPr>
       <w:r>
         <w:rPr>
           <w:i/>
+          <w:color w:val="5B6185"/>
+          <w:sz w:val="19"/>
         </w:rPr>
         <w:t>Tecnologias: Vue, Nuxt, TypeScript, Ruby on Rails, Node.js, Docker, AWS, PostgreSQL, CI/CD</w:t>
       </w:r>
     </w:p>
     <w:p>
+      <w:pPr>
+        <w:keepNext/>
+        <w:spacing w:before="80" w:after="40"/>
+      </w:pPr>
       <w:r>
         <w:rPr>
           <w:b/>
+          <w:color w:val="4F52C9"/>
         </w:rPr>
         <w:t>Desenvolvedor Full-stack</w:t>
       </w:r>
       <w:r>
-        <w:t xml:space="preserve"> | 2024 - 2025</w:t>
+        <w:rPr>
+          <w:color w:val="5B6185"/>
+        </w:rPr>
+        <w:t xml:space="preserve">   2024 - 2025</w:t>
       </w:r>
     </w:p>
     <w:p>
@@ -234,33 +339,54 @@
       </w:r>
     </w:p>
     <w:p>
+      <w:pPr>
+        <w:spacing w:after="80"/>
+      </w:pPr>
       <w:r>
         <w:rPr>
           <w:i/>
+          <w:color w:val="5B6185"/>
+          <w:sz w:val="19"/>
         </w:rPr>
         <w:t>Tecnologias: Vue, React, Nuxt, Ruby, AWS, Docker</w:t>
       </w:r>
     </w:p>
     <w:p>
+      <w:pPr>
+        <w:keepNext/>
+        <w:spacing w:before="120" w:after="0"/>
+      </w:pPr>
       <w:r>
         <w:rPr>
           <w:b/>
+          <w:sz w:val="23"/>
         </w:rPr>
         <w:t>APTIV</w:t>
       </w:r>
       <w:r>
-        <w:t xml:space="preserve"> | São José dos Campos, SP</w:t>
+        <w:rPr>
+          <w:color w:val="5B6185"/>
+        </w:rPr>
+        <w:t xml:space="preserve">   São José dos Campos, SP</w:t>
       </w:r>
     </w:p>
     <w:p>
+      <w:pPr>
+        <w:keepNext/>
+        <w:spacing w:before="80" w:after="40"/>
+      </w:pPr>
       <w:r>
         <w:rPr>
           <w:b/>
+          <w:color w:val="4F52C9"/>
         </w:rPr>
         <w:t>Desenvolvedor de Ferramentas Internas</w:t>
       </w:r>
       <w:r>
-        <w:t xml:space="preserve"> | 2022 - 2024</w:t>
+        <w:rPr>
+          <w:color w:val="5B6185"/>
+        </w:rPr>
+        <w:t xml:space="preserve">   2022 - 2024</w:t>
       </w:r>
     </w:p>
     <w:p>
@@ -280,23 +406,39 @@
       </w:r>
     </w:p>
     <w:p>
+      <w:pPr>
+        <w:spacing w:after="80"/>
+      </w:pPr>
       <w:r>
         <w:rPr>
           <w:i/>
+          <w:color w:val="5B6185"/>
+          <w:sz w:val="19"/>
         </w:rPr>
         <w:t>Tecnologias: Visual Basic, C#, SQL, React, Node.js, Docker</w:t>
       </w:r>
     </w:p>
     <w:p>
       <w:pPr>
-        <w:pStyle w:val="Heading2"/>
-        <w:spacing w:before="200" w:after="60"/>
+        <w:keepNext/>
+        <w:spacing w:before="240" w:after="100"/>
+        <w:pBdr>
+          <w:bottom w:val="single" w:sz="6" w:space="2" w:color="d9dcf0"/>
+        </w:pBdr>
       </w:pPr>
       <w:r>
-        <w:t>Formação Acadêmica</w:t>
+        <w:rPr>
+          <w:b/>
+          <w:color w:val="4F52C9"/>
+          <w:sz w:val="21"/>
+        </w:rPr>
+        <w:t>FORMAÇÃO ACADÊMICA</w:t>
       </w:r>
     </w:p>
     <w:p>
+      <w:pPr>
+        <w:spacing w:after="80"/>
+      </w:pPr>
       <w:r>
         <w:rPr>
           <w:b/>
@@ -304,10 +446,22 @@
         <w:t>Análise e Desenvolvimento de Sistemas</w:t>
       </w:r>
       <w:r>
-        <w:t xml:space="preserve"> | Universidade do Vale do Paraíba (Univap) | 03/2023 - 10/2025 | Concluído</w:t>
+        <w:br/>
+      </w:r>
+      <w:r>
+        <w:t>Universidade do Vale do Paraíba (Univap)</w:t>
+      </w:r>
+      <w:r>
+        <w:rPr>
+          <w:color w:val="5B6185"/>
+        </w:rPr>
+        <w:t xml:space="preserve">   03/2023 - 10/2025  |  Concluído</w:t>
       </w:r>
     </w:p>
     <w:p>
+      <w:pPr>
+        <w:spacing w:after="80"/>
+      </w:pPr>
       <w:r>
         <w:rPr>
           <w:b/>
@@ -315,10 +469,22 @@
         <w:t>Banco de Dados (Tecnólogo)</w:t>
       </w:r>
       <w:r>
-        <w:t xml:space="preserve"> | Fatec São José dos Campos | 2022 - atual</w:t>
+        <w:br/>
+      </w:r>
+      <w:r>
+        <w:t>Fatec São José dos Campos</w:t>
+      </w:r>
+      <w:r>
+        <w:rPr>
+          <w:color w:val="5B6185"/>
+        </w:rPr>
+        <w:t xml:space="preserve">   2022 - atual</w:t>
       </w:r>
     </w:p>
     <w:p>
+      <w:pPr>
+        <w:spacing w:after="80"/>
+      </w:pPr>
       <w:r>
         <w:rPr>
           <w:b/>
@@ -326,19 +492,39 @@
         <w:t>Técnico em Desenvolvimento de Sistemas</w:t>
       </w:r>
       <w:r>
-        <w:t xml:space="preserve"> | ETEC Profª Ilza Nascimento Pintus | 2019 - 2021</w:t>
+        <w:br/>
+      </w:r>
+      <w:r>
+        <w:t>ETEC Profª Ilza Nascimento Pintus</w:t>
+      </w:r>
+      <w:r>
+        <w:rPr>
+          <w:color w:val="5B6185"/>
+        </w:rPr>
+        <w:t xml:space="preserve">   2019 - 2021</w:t>
       </w:r>
     </w:p>
     <w:p>
       <w:pPr>
-        <w:pStyle w:val="Heading2"/>
-        <w:spacing w:before="200" w:after="60"/>
+        <w:keepNext/>
+        <w:spacing w:before="240" w:after="100"/>
+        <w:pBdr>
+          <w:bottom w:val="single" w:sz="6" w:space="2" w:color="d9dcf0"/>
+        </w:pBdr>
       </w:pPr>
       <w:r>
-        <w:t>Idiomas</w:t>
+        <w:rPr>
+          <w:b/>
+          <w:color w:val="4F52C9"/>
+          <w:sz w:val="21"/>
+        </w:rPr>
+        <w:t>IDIOMAS</w:t>
       </w:r>
     </w:p>
     <w:p>
+      <w:pPr>
+        <w:spacing w:after="40"/>
+      </w:pPr>
       <w:r>
         <w:rPr>
           <w:b/>
@@ -350,6 +536,9 @@
       </w:r>
     </w:p>
     <w:p>
+      <w:pPr>
+        <w:spacing w:after="40"/>
+      </w:pPr>
       <w:r>
         <w:rPr>
           <w:b/>
@@ -362,7 +551,7 @@
     </w:p>
     <w:sectPr>
       <w:pgSz w:w="12240" w:h="15840"/>
-      <w:pgMar w:top="1020" w:right="1134" w:bottom="1020" w:left="1134" w:header="720" w:footer="720" w:gutter="0"/>
+      <w:pgMar w:top="907" w:right="1134" w:bottom="907" w:left="1134" w:header="720" w:footer="720" w:gutter="0"/>
       <w:cols w:space="720"/>
       <w:docGrid w:linePitch="360"/>
     </w:sectPr>
@@ -734,10 +923,11 @@
     <w:qFormat/>
     <w:rsid w:val="00FC693F"/>
     <w:pPr>
-      <w:spacing w:after="40"/>
+      <w:spacing w:after="60" w:line="276" w:lineRule="auto"/>
     </w:pPr>
     <w:rPr>
       <w:rFonts w:ascii="Calibri" w:hAnsi="Calibri"/>
+      <w:color w:val="1D2350"/>
       <w:sz w:val="21"/>
     </w:rPr>
   </w:style>
@@ -1267,8 +1457,12 @@
       <w:numPr>
         <w:numId w:val="1"/>
       </w:numPr>
+      <w:spacing w:after="40"/>
       <w:contextualSpacing/>
     </w:pPr>
+    <w:rPr>
+      <w:sz w:val="20"/>
+    </w:rPr>
   </w:style>
   <w:style w:type="paragraph" w:styleId="ListBullet2">
     <w:name w:val="List Bullet 2"/>

</xml_diff>